<commit_message>
docs(NFR-FEAT-001): record applicant-profile owner decisions and blockers
</commit_message>
<xml_diff>
--- a/feature-plans/IMPLEMENTATION-PLAN-NFR-FEAT-001-APPLICANT-PROFILE.docx
+++ b/feature-plans/IMPLEMENTATION-PLAN-NFR-FEAT-001-APPLICANT-PROFILE.docx
@@ -40,10 +40,7 @@
         <w:rPr>
           <w:b/>
         </w:rPr>
-        <w:t xml:space="preserve">Status: </w:t>
-      </w:r>
-      <w:r>
-        <w:t>DRAFT — awaiting owner decisions; no application code implemented</w:t>
+        <w:t>Status: REVISED DRAFT — owner responses recorded; four clarifications required before implementation</w:t>
       </w:r>
     </w:p>
     <w:p>
@@ -94,7 +91,7 @@
     </w:p>
     <w:p>
       <w:r>
-        <w:t>This document proposes what should be implemented and why. It does not authorize implementation. Owner decisions in Section 17 must be confirmed before the Red → Green TDD cycle begins.</w:t>
+        <w:t>This document proposes what should be implemented and why. It does not authorize implementation. Owner responses are recorded in Section 20; implementation remains paused until the four outstanding clarifications are confirmed.</w:t>
       </w:r>
     </w:p>
     <w:p>
@@ -3623,7 +3620,7 @@
         <w:pStyle w:val="Heading1"/>
       </w:pPr>
       <w:r>
-        <w:t>17. Owner Questions — answers required before implementation</w:t>
+        <w:t>17. Original Owner Questions (responses recorded in Section 20)</w:t>
       </w:r>
     </w:p>
     <w:p>
@@ -3846,7 +3843,649 @@
     </w:p>
     <w:p>
       <w:r>
-        <w:t>Approve the progressive, privacy-first profile design with an optional photo/default person icon, detailed structured employment entries, applicant ownership, blind-review support, and immutable application snapshots. Resolve the authorization/security dependencies before exposing profiles to recruiters. Begin implementation only after Section 17 decisions are confirmed.</w:t>
+        <w:t>Proceed with the approved progressive, privacy-first profile design after resolving the four questions in Section 20. Do not implement race-derived avatars or public-internet PII exposure without an explicit revised decision and legal/privacy review. Resolve authorization and security dependencies before exposing profiles to recruiters or hiring managers.</w:t>
+      </w:r>
+    </w:p>
+    <w:p>
+      <w:r>
+        <w:br w:type="page"/>
+      </w:r>
+    </w:p>
+    <w:p>
+      <w:pPr>
+        <w:pStyle w:val="Heading1"/>
+      </w:pPr>
+      <w:r>
+        <w:t>20. Owner Decision Addendum — Revision 2</w:t>
+      </w:r>
+    </w:p>
+    <w:p>
+      <w:r>
+        <w:t>Owner responses received 2026-09-12. This section supersedes conflicting recommendations elsewhere in the draft. Items marked “Clarification required” block implementation.</w:t>
+      </w:r>
+    </w:p>
+    <w:tbl>
+      <w:tblPr>
+        <w:tblStyle w:val="TableGrid"/>
+        <w:tblW w:type="auto" w:w="0"/>
+        <w:jc w:val="center"/>
+        <w:tblLook w:firstColumn="1" w:firstRow="1" w:lastColumn="0" w:lastRow="0" w:noHBand="0" w:noVBand="1" w:val="04A0"/>
+      </w:tblPr>
+      <w:tblGrid>
+        <w:gridCol w:w="3360"/>
+        <w:gridCol w:w="3360"/>
+        <w:gridCol w:w="3360"/>
+      </w:tblGrid>
+      <w:tr>
+        <w:tc>
+          <w:tcPr>
+            <w:tcW w:type="dxa" w:w="3360"/>
+            <w:shd w:fill="D9EAF7"/>
+          </w:tcPr>
+          <w:p>
+            <w:r>
+              <w:rPr>
+                <w:b/>
+              </w:rPr>
+              <w:t>#</w:t>
+            </w:r>
+          </w:p>
+        </w:tc>
+        <w:tc>
+          <w:tcPr>
+            <w:tcW w:type="dxa" w:w="3360"/>
+            <w:shd w:fill="D9EAF7"/>
+          </w:tcPr>
+          <w:p>
+            <w:r>
+              <w:rPr>
+                <w:b/>
+              </w:rPr>
+              <w:t>Owner response</w:t>
+            </w:r>
+          </w:p>
+        </w:tc>
+        <w:tc>
+          <w:tcPr>
+            <w:tcW w:type="dxa" w:w="3360"/>
+            <w:shd w:fill="D9EAF7"/>
+          </w:tcPr>
+          <w:p>
+            <w:r>
+              <w:rPr>
+                <w:b/>
+              </w:rPr>
+              <w:t>Recorded implementation decision / status</w:t>
+            </w:r>
+          </w:p>
+        </w:tc>
+      </w:tr>
+      <w:tr>
+        <w:tc>
+          <w:tcPr>
+            <w:tcW w:type="dxa" w:w="3360"/>
+          </w:tcPr>
+          <w:p>
+            <w:r>
+              <w:t>1</w:t>
+            </w:r>
+          </w:p>
+        </w:tc>
+        <w:tc>
+          <w:tcPr>
+            <w:tcW w:type="dxa" w:w="3360"/>
+          </w:tcPr>
+          <w:p>
+            <w:r>
+              <w:t>Photos optional; neutral person based on applicant race.</w:t>
+            </w:r>
+          </w:p>
+        </w:tc>
+        <w:tc>
+          <w:tcPr>
+            <w:tcW w:type="dxa" w:w="3360"/>
+          </w:tcPr>
+          <w:p>
+            <w:r>
+              <w:t>PARTIALLY ACCEPTED / CLARIFICATION REQUIRED. Photo is optional. No race may be inferred, collected, or used to assign an avatar. Recommended safe alternatives: one race-agnostic neutral person icon, or applicant-selected inclusive visual variants without storing a race attribute.</w:t>
+            </w:r>
+          </w:p>
+        </w:tc>
+      </w:tr>
+      <w:tr>
+        <w:tc>
+          <w:tcPr>
+            <w:tcW w:type="dxa" w:w="3360"/>
+          </w:tcPr>
+          <w:p>
+            <w:r>
+              <w:t>2</w:t>
+            </w:r>
+          </w:p>
+        </w:tc>
+        <w:tc>
+          <w:tcPr>
+            <w:tcW w:type="dxa" w:w="3360"/>
+          </w:tcPr>
+          <w:p>
+            <w:r>
+              <w:t>Photo, name, and email publicly seen; phone after initial blind-review mode.</w:t>
+            </w:r>
+          </w:p>
+        </w:tc>
+        <w:tc>
+          <w:tcPr>
+            <w:tcW w:type="dxa" w:w="3360"/>
+          </w:tcPr>
+          <w:p>
+            <w:r>
+              <w:t>CLARIFICATION REQUIRED. Recommended interpretation: visible to authenticated authorized recruiters/hiring managers, not the open internet. Phone remains hidden until the configured post-initial-review stage. Because name/photo/email remain visible, this is staged-contact review—not fully blind review.</w:t>
+            </w:r>
+          </w:p>
+        </w:tc>
+      </w:tr>
+      <w:tr>
+        <w:tc>
+          <w:tcPr>
+            <w:tcW w:type="dxa" w:w="3360"/>
+          </w:tcPr>
+          <w:p>
+            <w:r>
+              <w:t>3</w:t>
+            </w:r>
+          </w:p>
+        </w:tc>
+        <w:tc>
+          <w:tcPr>
+            <w:tcW w:type="dxa" w:w="3360"/>
+          </w:tcPr>
+          <w:p>
+            <w:r>
+              <w:t>Yes to 1:1 authentication; one person may have multiple accounts with different logins/security roles.</w:t>
+            </w:r>
+          </w:p>
+        </w:tc>
+        <w:tc>
+          <w:tcPr>
+            <w:tcW w:type="dxa" w:w="3360"/>
+          </w:tcPr>
+          <w:p>
+            <w:r>
+              <w:t>ACCEPTED WITH MODEL CLARIFICATION REQUIRED. Introduce PersonIdentity → many UserAccounts. Each login has isolated credentials and role assignments; permissions never combine across sessions. Recommend one designated applicant-role account owns the ApplicantProfile; staff-role accounts remain separate.</w:t>
+            </w:r>
+          </w:p>
+        </w:tc>
+      </w:tr>
+      <w:tr>
+        <w:tc>
+          <w:tcPr>
+            <w:tcW w:type="dxa" w:w="3360"/>
+          </w:tcPr>
+          <w:p>
+            <w:r>
+              <w:t>4</w:t>
+            </w:r>
+          </w:p>
+        </w:tc>
+        <w:tc>
+          <w:tcPr>
+            <w:tcW w:type="dxa" w:w="3360"/>
+          </w:tcPr>
+          <w:p>
+            <w:r>
+              <w:t>Approve recommended minimum fields and progressive completion.</w:t>
+            </w:r>
+          </w:p>
+        </w:tc>
+        <w:tc>
+          <w:tcPr>
+            <w:tcW w:type="dxa" w:w="3360"/>
+          </w:tcPr>
+          <w:p>
+            <w:r>
+              <w:t>ACCEPTED. Initial profile requires legal name, verified email, one contact method, US location, and work-authorization answers; remaining sections can be completed progressively.</w:t>
+            </w:r>
+          </w:p>
+        </w:tc>
+      </w:tr>
+      <w:tr>
+        <w:tc>
+          <w:tcPr>
+            <w:tcW w:type="dxa" w:w="3360"/>
+          </w:tcPr>
+          <w:p>
+            <w:r>
+              <w:t>5</w:t>
+            </w:r>
+          </w:p>
+        </w:tc>
+        <w:tc>
+          <w:tcPr>
+            <w:tcW w:type="dxa" w:w="3360"/>
+          </w:tcPr>
+          <w:p>
+            <w:r>
+              <w:t>Approve required employment position description.</w:t>
+            </w:r>
+          </w:p>
+        </w:tc>
+        <w:tc>
+          <w:tcPr>
+            <w:tcW w:type="dxa" w:w="3360"/>
+          </w:tcPr>
+          <w:p>
+            <w:r>
+              <w:t>ACCEPTED. Every employment entry requires company, title, position description (recommended 50–2,000 chars), and valid dates; responsibilities/accomplishments remain separate optional lists.</w:t>
+            </w:r>
+          </w:p>
+        </w:tc>
+      </w:tr>
+      <w:tr>
+        <w:tc>
+          <w:tcPr>
+            <w:tcW w:type="dxa" w:w="3360"/>
+          </w:tcPr>
+          <w:p>
+            <w:r>
+              <w:t>6</w:t>
+            </w:r>
+          </w:p>
+        </w:tc>
+        <w:tc>
+          <w:tcPr>
+            <w:tcW w:type="dxa" w:w="3360"/>
+          </w:tcPr>
+          <w:p>
+            <w:r>
+              <w:t>Vercel storage.</w:t>
+            </w:r>
+          </w:p>
+        </w:tc>
+        <w:tc>
+          <w:tcPr>
+            <w:tcW w:type="dxa" w:w="3360"/>
+          </w:tcPr>
+          <w:p>
+            <w:r>
+              <w:t>ACCEPTED. Use private Vercel Blob storage for photos/resumes; store metadata/blob key only in application data. Use short-lived access URLs, MIME/signature/size validation, random filenames, deletion, and production malware-scanning integration.</w:t>
+            </w:r>
+          </w:p>
+        </w:tc>
+      </w:tr>
+      <w:tr>
+        <w:tc>
+          <w:tcPr>
+            <w:tcW w:type="dxa" w:w="3360"/>
+          </w:tcPr>
+          <w:p>
+            <w:r>
+              <w:t>7</w:t>
+            </w:r>
+          </w:p>
+        </w:tc>
+        <w:tc>
+          <w:tcPr>
+            <w:tcW w:type="dxa" w:w="3360"/>
+          </w:tcPr>
+          <w:p>
+            <w:r>
+              <w:t>Defer resume parsing.</w:t>
+            </w:r>
+          </w:p>
+        </w:tc>
+        <w:tc>
+          <w:tcPr>
+            <w:tcW w:type="dxa" w:w="3360"/>
+          </w:tcPr>
+          <w:p>
+            <w:r>
+              <w:t>ACCEPTED. Consent-based resume parsing remains a later phase after secure profile ownership and core fields are stable.</w:t>
+            </w:r>
+          </w:p>
+        </w:tc>
+      </w:tr>
+      <w:tr>
+        <w:tc>
+          <w:tcPr>
+            <w:tcW w:type="dxa" w:w="3360"/>
+          </w:tcPr>
+          <w:p>
+            <w:r>
+              <w:t>8</w:t>
+            </w:r>
+          </w:p>
+        </w:tc>
+        <w:tc>
+          <w:tcPr>
+            <w:tcW w:type="dxa" w:w="3360"/>
+          </w:tcPr>
+          <w:p>
+            <w:r>
+              <w:t>Approve immutable application snapshots.</w:t>
+            </w:r>
+          </w:p>
+        </w:tc>
+        <w:tc>
+          <w:tcPr>
+            <w:tcW w:type="dxa" w:w="3360"/>
+          </w:tcPr>
+          <w:p>
+            <w:r>
+              <w:t>ACCEPTED. Each application preserves profile data and matching inputs exactly as submitted, including profile/schema/matching-algorithm versions.</w:t>
+            </w:r>
+          </w:p>
+        </w:tc>
+      </w:tr>
+      <w:tr>
+        <w:tc>
+          <w:tcPr>
+            <w:tcW w:type="dxa" w:w="3360"/>
+          </w:tcPr>
+          <w:p>
+            <w:r>
+              <w:t>9</w:t>
+            </w:r>
+          </w:p>
+        </w:tc>
+        <w:tc>
+          <w:tcPr>
+            <w:tcW w:type="dxa" w:w="3360"/>
+          </w:tcPr>
+          <w:p>
+            <w:r>
+              <w:t>United States only.</w:t>
+            </w:r>
+          </w:p>
+        </w:tc>
+        <w:tc>
+          <w:tcPr>
+            <w:tcW w:type="dxa" w:w="3360"/>
+          </w:tcPr>
+          <w:p>
+            <w:r>
+              <w:t>ACCEPTED. Initial address, phone, work authorization, and privacy workflows target US rules/formats; model keeps country field for future migration.</w:t>
+            </w:r>
+          </w:p>
+        </w:tc>
+      </w:tr>
+      <w:tr>
+        <w:tc>
+          <w:tcPr>
+            <w:tcW w:type="dxa" w:w="3360"/>
+          </w:tcPr>
+          <w:p>
+            <w:r>
+              <w:t>10</w:t>
+            </w:r>
+          </w:p>
+        </w:tc>
+        <w:tc>
+          <w:tcPr>
+            <w:tcW w:type="dxa" w:w="3360"/>
+          </w:tcPr>
+          <w:p>
+            <w:r>
+              <w:t>Unsure; follow CCPA.</w:t>
+            </w:r>
+          </w:p>
+        </w:tc>
+        <w:tc>
+          <w:tcPr>
+            <w:tcW w:type="dxa" w:w="3360"/>
+          </w:tcPr>
+          <w:p>
+            <w:r>
+              <w:t>ACCEPTED AS POLICY DIRECTION, LEGAL REVIEW REQUIRED. Implement CCPA-oriented notice, access, correction, deletion, portability, retention, and sale/sharing opt-out controls. Final retention periods and exceptions require qualified legal counsel.</w:t>
+            </w:r>
+          </w:p>
+        </w:tc>
+      </w:tr>
+      <w:tr>
+        <w:tc>
+          <w:tcPr>
+            <w:tcW w:type="dxa" w:w="3360"/>
+          </w:tcPr>
+          <w:p>
+            <w:r>
+              <w:t>11</w:t>
+            </w:r>
+          </w:p>
+        </w:tc>
+        <w:tc>
+          <w:tcPr>
+            <w:tcW w:type="dxa" w:w="3360"/>
+          </w:tcPr>
+          <w:p>
+            <w:r>
+              <w:t>Compensation visible to authorized recruiters.</w:t>
+            </w:r>
+          </w:p>
+        </w:tc>
+        <w:tc>
+          <w:tcPr>
+            <w:tcW w:type="dxa" w:w="3360"/>
+          </w:tcPr>
+          <w:p>
+            <w:r>
+              <w:t>ACCEPTED. Compensation is private and available only to explicitly authorized recruiter/member-services roles; hiring-manager access requires separate policy decision. Excluded from public responses and audit-log details.</w:t>
+            </w:r>
+          </w:p>
+        </w:tc>
+      </w:tr>
+      <w:tr>
+        <w:tc>
+          <w:tcPr>
+            <w:tcW w:type="dxa" w:w="3360"/>
+          </w:tcPr>
+          <w:p>
+            <w:r>
+              <w:t>12</w:t>
+            </w:r>
+          </w:p>
+        </w:tc>
+        <w:tc>
+          <w:tcPr>
+            <w:tcW w:type="dxa" w:w="3360"/>
+          </w:tcPr>
+          <w:p>
+            <w:r>
+              <w:t>Move notificationToManager out of applicant profile.</w:t>
+            </w:r>
+          </w:p>
+        </w:tc>
+        <w:tc>
+          <w:tcPr>
+            <w:tcW w:type="dxa" w:w="3360"/>
+          </w:tcPr>
+          <w:p>
+            <w:r>
+              <w:t>ACCEPTED. Move it to application/hiring workflow notification configuration; migrate legacy data safely.</w:t>
+            </w:r>
+          </w:p>
+        </w:tc>
+      </w:tr>
+      <w:tr>
+        <w:tc>
+          <w:tcPr>
+            <w:tcW w:type="dxa" w:w="3360"/>
+          </w:tcPr>
+          <w:p>
+            <w:r>
+              <w:t>13</w:t>
+            </w:r>
+          </w:p>
+        </w:tc>
+        <w:tc>
+          <w:tcPr>
+            <w:tcW w:type="dxa" w:w="3360"/>
+          </w:tcPr>
+          <w:p>
+            <w:r>
+              <w:t>Accommodation requests must be known to hiring managers.</w:t>
+            </w:r>
+          </w:p>
+        </w:tc>
+        <w:tc>
+          <w:tcPr>
+            <w:tcW w:type="dxa" w:w="3360"/>
+          </w:tcPr>
+          <w:p>
+            <w:r>
+              <w:t>ACCEPTED WITH SAFEGUARDS / CLARIFICATION REQUIRED. Collect requested accommodation—not diagnosis—through explicit consent. Limit access to assigned hiring managers and authorized HR/member-services; audit every access; exclude from matching and general/public profile responses.</w:t>
+            </w:r>
+          </w:p>
+        </w:tc>
+      </w:tr>
+    </w:tbl>
+    <w:p>
+      <w:pPr>
+        <w:pStyle w:val="Heading2"/>
+      </w:pPr>
+      <w:r>
+        <w:t>20.1 CCPA-Oriented Product Requirements</w:t>
+      </w:r>
+    </w:p>
+    <w:p>
+      <w:pPr>
+        <w:pStyle w:val="ListBullet"/>
+      </w:pPr>
+      <w:r>
+        <w:t>Notice at collection: explain categories, purposes, retention, and recipients before profile data is submitted.</w:t>
+      </w:r>
+    </w:p>
+    <w:p>
+      <w:pPr>
+        <w:pStyle w:val="ListBullet"/>
+      </w:pPr>
+      <w:r>
+        <w:t>Right to know/access: authenticated applicant can view collected categories, sources, purposes, recipients, and stored profile/application data.</w:t>
+      </w:r>
+    </w:p>
+    <w:p>
+      <w:pPr>
+        <w:pStyle w:val="ListBullet"/>
+      </w:pPr>
+      <w:r>
+        <w:t>Right to correct: applicant can correct profile data while immutable application snapshots remain historically accurate and visibly versioned.</w:t>
+      </w:r>
+    </w:p>
+    <w:p>
+      <w:pPr>
+        <w:pStyle w:val="ListBullet"/>
+      </w:pPr>
+      <w:r>
+        <w:t>Right to delete: verified request workflow; immediate account/profile deactivation; purge schedule and legal exceptions documented. Recommended 30-day recovery window remains provisional until legal approval.</w:t>
+      </w:r>
+    </w:p>
+    <w:p>
+      <w:pPr>
+        <w:pStyle w:val="ListBullet"/>
+      </w:pPr>
+      <w:r>
+        <w:t>Data portability: authenticated machine-readable export; time-limited download; recent authentication required.</w:t>
+      </w:r>
+    </w:p>
+    <w:p>
+      <w:pPr>
+        <w:pStyle w:val="ListBullet"/>
+      </w:pPr>
+      <w:r>
+        <w:t>Opt out of sale/sharing: the application should not sell applicant data. If advertising/cross-context sharing is ever introduced, provide required opt-out controls and honor Global Privacy Control as applicable.</w:t>
+      </w:r>
+    </w:p>
+    <w:p>
+      <w:pPr>
+        <w:pStyle w:val="ListBullet"/>
+      </w:pPr>
+      <w:r>
+        <w:t>Data minimization and retention: retain only fields needed for recruiting/legal purposes; publish schedules by data category; automatically remove expired uploads and inactive profiles according to approved policy.</w:t>
+      </w:r>
+    </w:p>
+    <w:p>
+      <w:pPr>
+        <w:pStyle w:val="ListBullet"/>
+      </w:pPr>
+      <w:r>
+        <w:t>Non-discrimination: privacy-right requests must not reduce applicant access or opportunity.</w:t>
+      </w:r>
+    </w:p>
+    <w:p>
+      <w:pPr>
+        <w:pStyle w:val="ListBullet"/>
+      </w:pPr>
+      <w:r>
+        <w:t>Vendor governance: Vercel and other processors require appropriate agreements, access controls, deletion propagation, and documented subprocessors.</w:t>
+      </w:r>
+    </w:p>
+    <w:p>
+      <w:pPr>
+        <w:pStyle w:val="ListBullet"/>
+      </w:pPr>
+      <w:r>
+        <w:t>This is a product-design baseline, not legal advice; US/California counsel must approve final policy, retention periods, notices, and exceptions.</w:t>
+      </w:r>
+    </w:p>
+    <w:p>
+      <w:pPr>
+        <w:pStyle w:val="Heading2"/>
+      </w:pPr>
+      <w:r>
+        <w:t>20.2 Outstanding Clarifications — implementation blocked</w:t>
+      </w:r>
+    </w:p>
+    <w:p>
+      <w:r>
+        <w:rPr>
+          <w:b/>
+        </w:rPr>
+        <w:t xml:space="preserve">C1 — Avatar representation: </w:t>
+      </w:r>
+      <w:r>
+        <w:t>Choose one: (A) one universal race-agnostic person icon (recommended), or (B) applicant-selected inclusive visual variants/skin tones without collecting or inferring race. The system will not derive an icon from race.</w:t>
+      </w:r>
+    </w:p>
+    <w:p>
+      <w:r>
+        <w:rPr>
+          <w:b/>
+        </w:rPr>
+        <w:t xml:space="preserve">C2 — Meaning of “public”: </w:t>
+      </w:r>
+      <w:r>
+        <w:t>Should name/photo/email be visible (A) only to authenticated authorized recruiters/hiring managers (recommended), or (B) to anyone on the public internet? Public-internet PII exposure is strongly discouraged and would require explicit privacy/legal approval.</w:t>
+      </w:r>
+    </w:p>
+    <w:p>
+      <w:r>
+        <w:rPr>
+          <w:b/>
+        </w:rPr>
+        <w:t xml:space="preserve">C3 — Multiple accounts and one profile: </w:t>
+      </w:r>
+      <w:r>
+        <w:t>If one person has applicant, recruiter, and hiring-manager logins, should the ApplicantProfile be owned only by the applicant login (recommended), or shared across linked accounts? Roles and credentials will remain isolated either way.</w:t>
+      </w:r>
+    </w:p>
+    <w:p>
+      <w:r>
+        <w:rPr>
+          <w:b/>
+        </w:rPr>
+        <w:t xml:space="preserve">C4 — Accommodation timing/access: </w:t>
+      </w:r>
+      <w:r>
+        <w:t>At what stage do accommodations become visible: application submission, interview scheduling (recommended), or immediately on profile review? Should access be assigned hiring managers only (recommended) or every hiring-manager account?</w:t>
+      </w:r>
+    </w:p>
+    <w:p>
+      <w:r>
+        <w:rPr>
+          <w:b/>
+        </w:rPr>
+        <w:t xml:space="preserve">Implementation status: </w:t>
+      </w:r>
+      <w:r>
+        <w:t>PAUSED. No source code, data model, routes, or tests will be changed until C1–C4 are answered.</w:t>
       </w:r>
     </w:p>
     <w:sectPr>

</xml_diff>

<commit_message>
docs(NFR-FEAT-001): finalize applicant-profile owner decisions
</commit_message>
<xml_diff>
--- a/feature-plans/IMPLEMENTATION-PLAN-NFR-FEAT-001-APPLICANT-PROFILE.docx
+++ b/feature-plans/IMPLEMENTATION-PLAN-NFR-FEAT-001-APPLICANT-PROFILE.docx
@@ -40,7 +40,7 @@
         <w:rPr>
           <w:b/>
         </w:rPr>
-        <w:t>Status: REVISED DRAFT — owner responses recorded; four clarifications required before implementation</w:t>
+        <w:t>Status: REQUIREMENTS APPROVED — all owner questions resolved; ready for TDD implementation upon explicit owner direction</w:t>
       </w:r>
     </w:p>
     <w:p>
@@ -3843,7 +3843,7 @@
     </w:p>
     <w:p>
       <w:r>
-        <w:t>Proceed with the approved progressive, privacy-first profile design after resolving the four questions in Section 20. Do not implement race-derived avatars or public-internet PII exposure without an explicit revised decision and legal/privacy review. Resolve authorization and security dependencies before exposing profiles to recruiters or hiring managers.</w:t>
+        <w:t>The four owner clarifications are resolved. Proceed, upon explicit owner direction, with the approved progressive privacy-first profile: optional photo, universal race-agnostic default icon, authenticated authorized visibility, isolated multi-account RBAC, detailed employment descriptions, private Vercel Blob storage, immutable application snapshots, US/CCPA-oriented controls, and accommodation visibility at interview scheduling for assigned hiring managers only. Resolve authorization and security dependencies before launch.</w:t>
       </w:r>
     </w:p>
     <w:p>
@@ -3861,7 +3861,7 @@
     </w:p>
     <w:p>
       <w:r>
-        <w:t>Owner responses received 2026-09-12. This section supersedes conflicting recommendations elsewhere in the draft. Items marked “Clarification required” block implementation.</w:t>
+        <w:t>Owner responses received and final clarifications confirmed 2026-09-12. This section supersedes conflicting recommendations elsewhere in the draft. All product questions are resolved; implementation still requires explicit owner direction.</w:t>
       </w:r>
     </w:p>
     <w:tbl>
@@ -3937,7 +3937,7 @@
           </w:tcPr>
           <w:p>
             <w:r>
-              <w:t>Photos optional; neutral person based on applicant race.</w:t>
+              <w:t>Option A: photo optional; one universal race-agnostic default person icon.</w:t>
             </w:r>
           </w:p>
         </w:tc>
@@ -3947,7 +3947,7 @@
           </w:tcPr>
           <w:p>
             <w:r>
-              <w:t>PARTIALLY ACCEPTED / CLARIFICATION REQUIRED. Photo is optional. No race may be inferred, collected, or used to assign an avatar. Recommended safe alternatives: one race-agnostic neutral person icon, or applicant-selected inclusive visual variants without storing a race attribute.</w:t>
+              <w:t>FINAL. Do not collect or infer race for avatar selection. Applicant photo remains optional; neutral icon always available.</w:t>
             </w:r>
           </w:p>
         </w:tc>
@@ -3969,7 +3969,7 @@
           </w:tcPr>
           <w:p>
             <w:r>
-              <w:t>Photo, name, and email publicly seen; phone after initial blind-review mode.</w:t>
+              <w:t>Option A: name, optional photo, and email visible only to authenticated authorized recruiters/hiring managers; phone after initial review.</w:t>
             </w:r>
           </w:p>
         </w:tc>
@@ -3979,7 +3979,7 @@
           </w:tcPr>
           <w:p>
             <w:r>
-              <w:t>CLARIFICATION REQUIRED. Recommended interpretation: visible to authenticated authorized recruiters/hiring managers, not the open internet. Phone remains hidden until the configured post-initial-review stage. Because name/photo/email remain visible, this is staged-contact review—not fully blind review.</w:t>
+              <w:t>FINAL. No public-internet PII exposure. Phone field remains protected until the configured post-initial-review stage.</w:t>
             </w:r>
           </w:p>
         </w:tc>
@@ -4001,7 +4001,7 @@
           </w:tcPr>
           <w:p>
             <w:r>
-              <w:t>Yes to 1:1 authentication; one person may have multiple accounts with different logins/security roles.</w:t>
+              <w:t>Option A: designated applicant login owns profile; one person may have separate accounts/logins and roles.</w:t>
             </w:r>
           </w:p>
         </w:tc>
@@ -4011,7 +4011,7 @@
           </w:tcPr>
           <w:p>
             <w:r>
-              <w:t>ACCEPTED WITH MODEL CLARIFICATION REQUIRED. Introduce PersonIdentity → many UserAccounts. Each login has isolated credentials and role assignments; permissions never combine across sessions. Recommend one designated applicant-role account owns the ApplicantProfile; staff-role accounts remain separate.</w:t>
+              <w:t>FINAL. PersonIdentity may link accounts, but credentials, sessions, and RBAC remain isolated. Staff-role accounts do not own or edit the applicant profile through applicant privileges.</w:t>
             </w:r>
           </w:p>
         </w:tc>
@@ -4321,7 +4321,7 @@
           </w:tcPr>
           <w:p>
             <w:r>
-              <w:t>Accommodation requests must be known to hiring managers.</w:t>
+              <w:t>Accommodation requests visible at interview scheduling to assigned hiring managers only.</w:t>
             </w:r>
           </w:p>
         </w:tc>
@@ -4331,7 +4331,7 @@
           </w:tcPr>
           <w:p>
             <w:r>
-              <w:t>ACCEPTED WITH SAFEGUARDS / CLARIFICATION REQUIRED. Collect requested accommodation—not diagnosis—through explicit consent. Limit access to assigned hiring managers and authorized HR/member-services; audit every access; exclude from matching and general/public profile responses.</w:t>
+              <w:t>FINAL. Collect accommodation need only—not diagnosis. Explicit consent, assigned-manager restriction, access audit, and exclusion from matching/general profile are mandatory.</w:t>
             </w:r>
           </w:p>
         </w:tc>
@@ -4430,7 +4430,27 @@
         <w:pStyle w:val="Heading2"/>
       </w:pPr>
       <w:r>
-        <w:t>20.2 Outstanding Clarifications — implementation blocked</w:t>
+        <w:t>20.2 Final Clarification Decisions — resolved</w:t>
+      </w:r>
+    </w:p>
+    <w:p>
+      <w:r>
+        <w:t>C1 — Avatar representation: RESOLVED — Option A. Use one universal, neutral, race-agnostic person icon when no optional photo is provided. Do not collect or infer race for avatar selection.</w:t>
+      </w:r>
+    </w:p>
+    <w:p>
+      <w:r>
+        <w:t>C2 — Profile visibility: RESOLVED — Option A. Name, optional photo, and email are visible only to authenticated, authorized recruiters and hiring managers—not to the public internet. Phone remains hidden during the initial review and becomes available only after the configured review stage.</w:t>
+      </w:r>
+    </w:p>
+    <w:p>
+      <w:r>
+        <w:t>C3 — Multiple accounts and one profile: RESOLVED — Option A. Only the designated applicant-role login owns and edits the ApplicantProfile. A person may hold separate recruiter/hiring-manager accounts, but credentials, sessions, and RBAC permissions remain isolated and staff accounts do not inherit applicant-profile ownership.</w:t>
+      </w:r>
+    </w:p>
+    <w:p>
+      <w:r>
+        <w:t>C4 — Accommodation timing/access: RESOLVED — Accommodation requests become visible at interview scheduling to assigned hiring managers only. Collect the requested accommodation—not diagnosis/medical history—under explicit applicant consent; audit each access; exclude it from matching and general profile responses.</w:t>
       </w:r>
     </w:p>
     <w:p>
@@ -4438,54 +4458,20 @@
         <w:rPr>
           <w:b/>
         </w:rPr>
-        <w:t xml:space="preserve">C1 — Avatar representation: </w:t>
+        <w:t>Implementation status: REQUIREMENTS APPROVED. C1–C4 are resolved. No source code, data model, routes, or tests have been changed as part of this planning work. Begin the Red → Green TDD implementation only after explicit owner direction.</w:t>
       </w:r>
+    </w:p>
+    <w:p>
+      <w:pPr>
+        <w:pStyle w:val="Heading1"/>
+      </w:pPr>
       <w:r>
-        <w:t>Choose one: (A) one universal race-agnostic person icon (recommended), or (B) applicant-selected inclusive visual variants/skin tones without collecting or inferring race. The system will not derive an icon from race.</w:t>
+        <w:t>21. Final Owner Approval Record</w:t>
       </w:r>
     </w:p>
     <w:p>
       <w:r>
-        <w:rPr>
-          <w:b/>
-        </w:rPr>
-        <w:t xml:space="preserve">C2 — Meaning of “public”: </w:t>
-      </w:r>
-      <w:r>
-        <w:t>Should name/photo/email be visible (A) only to authenticated authorized recruiters/hiring managers (recommended), or (B) to anyone on the public internet? Public-internet PII exposure is strongly discouraged and would require explicit privacy/legal approval.</w:t>
-      </w:r>
-    </w:p>
-    <w:p>
-      <w:r>
-        <w:rPr>
-          <w:b/>
-        </w:rPr>
-        <w:t xml:space="preserve">C3 — Multiple accounts and one profile: </w:t>
-      </w:r>
-      <w:r>
-        <w:t>If one person has applicant, recruiter, and hiring-manager logins, should the ApplicantProfile be owned only by the applicant login (recommended), or shared across linked accounts? Roles and credentials will remain isolated either way.</w:t>
-      </w:r>
-    </w:p>
-    <w:p>
-      <w:r>
-        <w:rPr>
-          <w:b/>
-        </w:rPr>
-        <w:t xml:space="preserve">C4 — Accommodation timing/access: </w:t>
-      </w:r>
-      <w:r>
-        <w:t>At what stage do accommodations become visible: application submission, interview scheduling (recommended), or immediately on profile review? Should access be assigned hiring managers only (recommended) or every hiring-manager account?</w:t>
-      </w:r>
-    </w:p>
-    <w:p>
-      <w:r>
-        <w:rPr>
-          <w:b/>
-        </w:rPr>
-        <w:t xml:space="preserve">Implementation status: </w:t>
-      </w:r>
-      <w:r>
-        <w:t>PAUSED. No source code, data model, routes, or tests will be changed until C1–C4 are answered.</w:t>
+        <w:t>Final decisions confirmed: universal race-agnostic default icon; authenticated authorized visibility for name/photo/email; applicant-owned profile with isolated multi-account RBAC; accommodations visible at interview scheduling to assigned hiring managers only. Requirements are approved for TDD implementation when the owner gives explicit direction.</w:t>
       </w:r>
     </w:p>
     <w:sectPr>

</xml_diff>

<commit_message>
docs(NFR-FEAT-001): record Phase 1 implementation and TDD evidence
</commit_message>
<xml_diff>
--- a/feature-plans/IMPLEMENTATION-PLAN-NFR-FEAT-001-APPLICANT-PROFILE.docx
+++ b/feature-plans/IMPLEMENTATION-PLAN-NFR-FEAT-001-APPLICANT-PROFILE.docx
@@ -40,7 +40,7 @@
         <w:rPr>
           <w:b/>
         </w:rPr>
-        <w:t>Status: REQUIREMENTS APPROVED — all owner questions resolved; ready for TDD implementation upon explicit owner direction</w:t>
+        <w:t>Status: IMPLEMENTATION IN PROGRESS — Phase 1 foundation/core profile complete; feature branch remains unmerged</w:t>
       </w:r>
     </w:p>
     <w:p>
@@ -4474,6 +4474,449 @@
         <w:t>Final decisions confirmed: universal race-agnostic default icon; authenticated authorized visibility for name/photo/email; applicant-owned profile with isolated multi-account RBAC; accommodations visible at interview scheduling to assigned hiring managers only. Requirements are approved for TDD implementation when the owner gives explicit direction.</w:t>
       </w:r>
     </w:p>
+    <w:p>
+      <w:r>
+        <w:br w:type="page"/>
+      </w:r>
+    </w:p>
+    <w:p>
+      <w:pPr>
+        <w:pStyle w:val="Heading1"/>
+      </w:pPr>
+      <w:r>
+        <w:t>22. Implementation Progress — Phase 1</w:t>
+      </w:r>
+    </w:p>
+    <w:p>
+      <w:r>
+        <w:t>Phase 1 implementation completed on branch feat/NFR-FEAT-001-applicant-profile. The branch is intentionally not merged because media, application snapshots, recruiter presentation, CCPA export/deletion, and accommodation workflow remain.</w:t>
+      </w:r>
+    </w:p>
+    <w:p>
+      <w:pPr>
+        <w:pStyle w:val="Heading2"/>
+      </w:pPr>
+      <w:r>
+        <w:t>22.1 Phase 1 Scope Implemented</w:t>
+      </w:r>
+    </w:p>
+    <w:p>
+      <w:pPr>
+        <w:pStyle w:val="ListBullet"/>
+      </w:pPr>
+      <w:r>
+        <w:t>Applicant-only POST /api/applicants/profile creates one profile owned by the authenticated applicant account.</w:t>
+      </w:r>
+    </w:p>
+    <w:p>
+      <w:pPr>
+        <w:pStyle w:val="ListBullet"/>
+      </w:pPr>
+      <w:r>
+        <w:t>UserAccount supports personId + applicantId while each login/session retains one isolated RBAC role; staff accounts do not inherit profile ownership.</w:t>
+      </w:r>
+    </w:p>
+    <w:p>
+      <w:pPr>
+        <w:pStyle w:val="ListBullet"/>
+      </w:pPr>
+      <w:r>
+        <w:t>Universal race-agnostic default person icon; no race field collected or inferred.</w:t>
+      </w:r>
+    </w:p>
+    <w:p>
+      <w:pPr>
+        <w:pStyle w:val="ListBullet"/>
+      </w:pPr>
+      <w:r>
+        <w:t>Fixed visibility policy metadata: email authorized-staff; phone post-initial-review.</w:t>
+      </w:r>
+    </w:p>
+    <w:p>
+      <w:pPr>
+        <w:pStyle w:val="ListBullet"/>
+      </w:pPr>
+      <w:r>
+        <w:t>GET/PATCH /api/applicants/me with allow-listed fields and protected ownership/identity fields.</w:t>
+      </w:r>
+    </w:p>
+    <w:p>
+      <w:pPr>
+        <w:pStyle w:val="ListBullet"/>
+      </w:pPr>
+      <w:r>
+        <w:t>Detailed employment CRUD + reorder with server-generated stable IDs, required 50–2,000 character position description, date validation, responsibilities, accomplishments, skills, employment type, location, and work mode.</w:t>
+      </w:r>
+    </w:p>
+    <w:p>
+      <w:pPr>
+        <w:pStyle w:val="ListBullet"/>
+      </w:pPr>
+      <w:r>
+        <w:t>Progressive completeness calculation across eight non-sensitive sections; photo/pronouns never reduce completeness.</w:t>
+      </w:r>
+    </w:p>
+    <w:p>
+      <w:pPr>
+        <w:pStyle w:val="ListBullet"/>
+      </w:pPr>
+      <w:r>
+        <w:t>Legacy applicant linking by unique normalized email, profile normalization, and user/applicant ownership persistence.</w:t>
+      </w:r>
+    </w:p>
+    <w:p>
+      <w:pPr>
+        <w:pStyle w:val="ListBullet"/>
+      </w:pPr>
+      <w:r>
+        <w:t>Profile/employment observability without logging email, phone, or employment description content.</w:t>
+      </w:r>
+    </w:p>
+    <w:p>
+      <w:pPr>
+        <w:pStyle w:val="ListBullet"/>
+      </w:pPr>
+      <w:r>
+        <w:t>Legacy profile creation restricted to member-services; cross-applicant legacy reads/updates denied; recruiter/hiring-manager initial profile views omit phone.</w:t>
+      </w:r>
+    </w:p>
+    <w:p>
+      <w:pPr>
+        <w:pStyle w:val="Heading2"/>
+      </w:pPr>
+      <w:r>
+        <w:t>22.2 TDD Evidence</w:t>
+      </w:r>
+    </w:p>
+    <w:tbl>
+      <w:tblPr>
+        <w:tblStyle w:val="TableGrid"/>
+        <w:tblW w:type="auto" w:w="0"/>
+        <w:jc w:val="center"/>
+        <w:tblLook w:firstColumn="1" w:firstRow="1" w:lastColumn="0" w:lastRow="0" w:noHBand="0" w:noVBand="1" w:val="04A0"/>
+      </w:tblPr>
+      <w:tblGrid>
+        <w:gridCol w:w="5040"/>
+        <w:gridCol w:w="5040"/>
+      </w:tblGrid>
+      <w:tr>
+        <w:tc>
+          <w:tcPr>
+            <w:tcW w:type="dxa" w:w="5040"/>
+            <w:shd w:fill="D9EAF7"/>
+          </w:tcPr>
+          <w:p>
+            <w:r>
+              <w:rPr>
+                <w:b/>
+              </w:rPr>
+              <w:t>Stage</w:t>
+            </w:r>
+          </w:p>
+        </w:tc>
+        <w:tc>
+          <w:tcPr>
+            <w:tcW w:type="dxa" w:w="5040"/>
+            <w:shd w:fill="D9EAF7"/>
+          </w:tcPr>
+          <w:p>
+            <w:r>
+              <w:rPr>
+                <w:b/>
+              </w:rPr>
+              <w:t>Observed result</w:t>
+            </w:r>
+          </w:p>
+        </w:tc>
+      </w:tr>
+      <w:tr>
+        <w:tc>
+          <w:tcPr>
+            <w:tcW w:type="dxa" w:w="5040"/>
+          </w:tcPr>
+          <w:p>
+            <w:r>
+              <w:t>Initial Red</w:t>
+            </w:r>
+          </w:p>
+        </w:tc>
+        <w:tc>
+          <w:tcPr>
+            <w:tcW w:type="dxa" w:w="5040"/>
+          </w:tcPr>
+          <w:p>
+            <w:r>
+              <w:t>10/10 feature tests failed with 404 because approved endpoints did not exist. Commit b6dd234.</w:t>
+            </w:r>
+          </w:p>
+        </w:tc>
+      </w:tr>
+      <w:tr>
+        <w:tc>
+          <w:tcPr>
+            <w:tcW w:type="dxa" w:w="5040"/>
+          </w:tcPr>
+          <w:p>
+            <w:r>
+              <w:t>Iteration 1</w:t>
+            </w:r>
+          </w:p>
+        </w:tc>
+        <w:tc>
+          <w:tcPr>
+            <w:tcW w:type="dxa" w:w="5040"/>
+          </w:tcPr>
+          <w:p>
+            <w:r>
+              <w:t>Typecheck issues corrected; 9 top-level/subtests passed and four negative employment subtests failed due nested-test fixture reset.</w:t>
+            </w:r>
+          </w:p>
+        </w:tc>
+      </w:tr>
+      <w:tr>
+        <w:tc>
+          <w:tcPr>
+            <w:tcW w:type="dxa" w:w="5040"/>
+          </w:tcPr>
+          <w:p>
+            <w:r>
+              <w:t>Iteration 2</w:t>
+            </w:r>
+          </w:p>
+        </w:tc>
+        <w:tc>
+          <w:tcPr>
+            <w:tcW w:type="dxa" w:w="5040"/>
+          </w:tcPr>
+          <w:p>
+            <w:r>
+              <w:t>Fixture isolation corrected; 14/14 passed.</w:t>
+            </w:r>
+          </w:p>
+        </w:tc>
+      </w:tr>
+      <w:tr>
+        <w:tc>
+          <w:tcPr>
+            <w:tcW w:type="dxa" w:w="5040"/>
+          </w:tcPr>
+          <w:p>
+            <w:r>
+              <w:t>Security review Red</w:t>
+            </w:r>
+          </w:p>
+        </w:tc>
+        <w:tc>
+          <w:tcPr>
+            <w:tcW w:type="dxa" w:w="5040"/>
+          </w:tcPr>
+          <w:p>
+            <w:r>
+              <w:t>Added cross-profile read, legacy creation, staff redaction, and caller-controlled employment-ID regressions. Two tests failed as expected. Commit 4ddf787.</w:t>
+            </w:r>
+          </w:p>
+        </w:tc>
+      </w:tr>
+      <w:tr>
+        <w:tc>
+          <w:tcPr>
+            <w:tcW w:type="dxa" w:w="5040"/>
+          </w:tcPr>
+          <w:p>
+            <w:r>
+              <w:t>Iteration 3</w:t>
+            </w:r>
+          </w:p>
+        </w:tc>
+        <w:tc>
+          <w:tcPr>
+            <w:tcW w:type="dxa" w:w="5040"/>
+          </w:tcPr>
+          <w:p>
+            <w:r>
+              <w:t>Legacy routes and employment ID generation secured; 15/15 feature assertions passed.</w:t>
+            </w:r>
+          </w:p>
+        </w:tc>
+      </w:tr>
+      <w:tr>
+        <w:tc>
+          <w:tcPr>
+            <w:tcW w:type="dxa" w:w="5040"/>
+          </w:tcPr>
+          <w:p>
+            <w:r>
+              <w:t>Full suite</w:t>
+            </w:r>
+          </w:p>
+        </w:tc>
+        <w:tc>
+          <w:tcPr>
+            <w:tcW w:type="dxa" w:w="5040"/>
+          </w:tcPr>
+          <w:p>
+            <w:r>
+              <w:t>21/21 passed: 15 NFR-FEAT-001 + 3 NFR-002 + 3 NFR-004.</w:t>
+            </w:r>
+          </w:p>
+        </w:tc>
+      </w:tr>
+      <w:tr>
+        <w:tc>
+          <w:tcPr>
+            <w:tcW w:type="dxa" w:w="5040"/>
+          </w:tcPr>
+          <w:p>
+            <w:r>
+              <w:t>Gates</w:t>
+            </w:r>
+          </w:p>
+        </w:tc>
+        <w:tc>
+          <w:tcPr>
+            <w:tcW w:type="dxa" w:w="5040"/>
+          </w:tcPr>
+          <w:p>
+            <w:r>
+              <w:t>tsc --noEmit PASS; tsc build PASS; git diff --check PASS. GitHub CI remains pending NFR-030.</w:t>
+            </w:r>
+          </w:p>
+        </w:tc>
+      </w:tr>
+    </w:tbl>
+    <w:p>
+      <w:pPr>
+        <w:pStyle w:val="Heading2"/>
+      </w:pPr>
+      <w:r>
+        <w:t>22.3 Implementation Files and Commits</w:t>
+      </w:r>
+    </w:p>
+    <w:p>
+      <w:pPr>
+        <w:pStyle w:val="ListBullet"/>
+      </w:pPr>
+      <w:r>
+        <w:t>src/models/store.ts — profile/account/avatar/skill/employment types.</w:t>
+      </w:r>
+    </w:p>
+    <w:p>
+      <w:pPr>
+        <w:pStyle w:val="ListBullet"/>
+      </w:pPr>
+      <w:r>
+        <w:t>src/services/applicantProfile.ts — validation, normalization, completeness, ownership resolution, safe patching.</w:t>
+      </w:r>
+    </w:p>
+    <w:p>
+      <w:pPr>
+        <w:pStyle w:val="ListBullet"/>
+      </w:pPr>
+      <w:r>
+        <w:t>src/routes/applicants.ts — owned profile and employment endpoints, legacy-route safeguards.</w:t>
+      </w:r>
+    </w:p>
+    <w:p>
+      <w:pPr>
+        <w:pStyle w:val="ListBullet"/>
+      </w:pPr>
+      <w:r>
+        <w:t>tests/features/NFR-FEAT-001-applicant-profile-core.test.ts — 15 passing assertions/subtests.</w:t>
+      </w:r>
+    </w:p>
+    <w:p>
+      <w:pPr>
+        <w:pStyle w:val="ListBullet"/>
+      </w:pPr>
+      <w:r>
+        <w:t>Commits: b6dd234 (initial failing specifications), 4ddf787 (security regressions), 1a799b8 (Phase 1 implementation).</w:t>
+      </w:r>
+    </w:p>
+    <w:p>
+      <w:pPr>
+        <w:pStyle w:val="Heading2"/>
+      </w:pPr>
+      <w:r>
+        <w:t>22.4 Remaining Before Feature Merge</w:t>
+      </w:r>
+    </w:p>
+    <w:p>
+      <w:pPr>
+        <w:pStyle w:val="ListBullet"/>
+      </w:pPr>
+      <w:r>
+        <w:t>AC-002: optional photo upload/delete with private Vercel Blob adapter and default-icon fallback.</w:t>
+      </w:r>
+    </w:p>
+    <w:p>
+      <w:pPr>
+        <w:pStyle w:val="ListBullet"/>
+      </w:pPr>
+      <w:r>
+        <w:t>AC-006: broader credentials/links/preferences/document metadata and private resume upload.</w:t>
+      </w:r>
+    </w:p>
+    <w:p>
+      <w:pPr>
+        <w:pStyle w:val="ListBullet"/>
+      </w:pPr>
+      <w:r>
+        <w:t>AC-007: immutable profile snapshot on application submission.</w:t>
+      </w:r>
+    </w:p>
+    <w:p>
+      <w:pPr>
+        <w:pStyle w:val="ListBullet"/>
+      </w:pPr>
+      <w:r>
+        <w:t>AC-008: formal authorized recruiter/hiring-manager view, staged phone reveal, blind/staged-review behavior, and score exclusion tests.</w:t>
+      </w:r>
+    </w:p>
+    <w:p>
+      <w:pPr>
+        <w:pStyle w:val="ListBullet"/>
+      </w:pPr>
+      <w:r>
+        <w:t>AC-012: CCPA-oriented authenticated export and approved deletion/retention workflow.</w:t>
+      </w:r>
+    </w:p>
+    <w:p>
+      <w:pPr>
+        <w:pStyle w:val="ListBullet"/>
+      </w:pPr>
+      <w:r>
+        <w:t>Accommodation workflow: collect need (not diagnosis), explicit consent, reveal at interview scheduling to assigned hiring managers only, audit access, exclude from matching/general profile.</w:t>
+      </w:r>
+    </w:p>
+    <w:p>
+      <w:pPr>
+        <w:pStyle w:val="ListBullet"/>
+      </w:pPr>
+      <w:r>
+        <w:t>Resolve/reconcile open security dependencies and add actual GitHub CI under NFR-030 before merge.</w:t>
+      </w:r>
+    </w:p>
+    <w:p>
+      <w:pPr>
+        <w:pStyle w:val="ListBullet"/>
+      </w:pPr>
+      <w:r>
+        <w:t>Pre-merge review item: ensure normalization never drops incomplete legacy education/skill data and persists stable legacy employment IDs for staff views.</w:t>
+      </w:r>
+    </w:p>
+    <w:p>
+      <w:pPr>
+        <w:pStyle w:val="Heading2"/>
+      </w:pPr>
+      <w:r>
+        <w:t>22.5 Current Status</w:t>
+      </w:r>
+    </w:p>
+    <w:p>
+      <w:r>
+        <w:t>PHASE 1 GREEN; FEATURE OPEN. No merge to main has occurred. Continue with a new Red phase for the next approved slice; do not treat NFR-FEAT-001 as resolved until all required acceptance criteria pass, implementation documentation is complete, and the post-merge regression review is performed.</w:t>
+      </w:r>
+    </w:p>
     <w:sectPr>
       <w:pgSz w:w="12240" w:h="15840"/>
       <w:pgMar w:top="936" w:right="1080" w:bottom="936" w:left="1080" w:header="720" w:footer="720" w:gutter="0"/>

</xml_diff>